<commit_message>
FEAT: add json via and buku panduan
</commit_message>
<xml_diff>
--- a/DOC/Kertas Panduan 12pad.docx
+++ b/DOC/Kertas Panduan 12pad.docx
@@ -1,6 +1,6 @@
 
 <file path=word/document.xml><?xml version="1.0" encoding="utf-8"?>
-<w:document xmlns:wpc="http://schemas.microsoft.com/office/word/2010/wordprocessingCanvas" xmlns:cx="http://schemas.microsoft.com/office/drawing/2014/chartex" xmlns:cx1="http://schemas.microsoft.com/office/drawing/2015/9/8/chartex" xmlns:cx2="http://schemas.microsoft.com/office/drawing/2015/10/21/chartex" xmlns:cx3="http://schemas.microsoft.com/office/drawing/2016/5/9/chartex" xmlns:cx4="http://schemas.microsoft.com/office/drawing/2016/5/10/chartex" xmlns:cx5="http://schemas.microsoft.com/office/drawing/2016/5/11/chartex" xmlns:cx6="http://schemas.microsoft.com/office/drawing/2016/5/12/chartex" xmlns:cx7="http://schemas.microsoft.com/office/drawing/2016/5/13/chartex" xmlns:cx8="http://schemas.microsoft.com/office/drawing/2016/5/14/chartex" xmlns:mc="http://schemas.openxmlformats.org/markup-compatibility/2006" xmlns:aink="http://schemas.microsoft.com/office/drawing/2016/ink" xmlns:am3d="http://schemas.microsoft.com/office/drawing/2017/model3d" xmlns:o="urn:schemas-microsoft-com:office:office" xmlns:oel="http://schemas.microsoft.com/office/2019/extlst" xmlns:r="http://schemas.openxmlformats.org/officeDocument/2006/relationships" xmlns:m="http://schemas.openxmlformats.org/officeDocument/2006/math" xmlns:v="urn:schemas-microsoft-com:vml" xmlns:wp14="http://schemas.microsoft.com/office/word/2010/wordprocessingDrawing" xmlns:wp="http://schemas.openxmlformats.org/drawingml/2006/wordprocessingDrawing" xmlns:w10="urn:schemas-microsoft-com:office:word" xmlns:w="http://schemas.openxmlformats.org/wordprocessingml/2006/main" xmlns:w14="http://schemas.microsoft.com/office/word/2010/wordml" xmlns:w15="http://schemas.microsoft.com/office/word/2012/wordml" xmlns:w16cex="http://schemas.microsoft.com/office/word/2018/wordml/cex" xmlns:w16cid="http://schemas.microsoft.com/office/word/2016/wordml/cid" xmlns:w16="http://schemas.microsoft.com/office/word/2018/wordml" xmlns:w16du="http://schemas.microsoft.com/office/word/2023/wordml/word16du" xmlns:w16sdtdh="http://schemas.microsoft.com/office/word/2020/wordml/sdtdatahash" xmlns:w16se="http://schemas.microsoft.com/office/word/2015/wordml/symex" xmlns:wpg="http://schemas.microsoft.com/office/word/2010/wordprocessingGroup" xmlns:wpi="http://schemas.microsoft.com/office/word/2010/wordprocessingInk" xmlns:wne="http://schemas.microsoft.com/office/word/2006/wordml" xmlns:wps="http://schemas.microsoft.com/office/word/2010/wordprocessingShape" mc:Ignorable="w14 w15 w16se w16cid w16 w16cex w16sdtdh w16du wp14">
+<w:document xmlns:wpc="http://schemas.microsoft.com/office/word/2010/wordprocessingCanvas" xmlns:cx="http://schemas.microsoft.com/office/drawing/2014/chartex" xmlns:cx1="http://schemas.microsoft.com/office/drawing/2015/9/8/chartex" xmlns:cx2="http://schemas.microsoft.com/office/drawing/2015/10/21/chartex" xmlns:cx3="http://schemas.microsoft.com/office/drawing/2016/5/9/chartex" xmlns:cx4="http://schemas.microsoft.com/office/drawing/2016/5/10/chartex" xmlns:cx5="http://schemas.microsoft.com/office/drawing/2016/5/11/chartex" xmlns:cx6="http://schemas.microsoft.com/office/drawing/2016/5/12/chartex" xmlns:cx7="http://schemas.microsoft.com/office/drawing/2016/5/13/chartex" xmlns:cx8="http://schemas.microsoft.com/office/drawing/2016/5/14/chartex" xmlns:mc="http://schemas.openxmlformats.org/markup-compatibility/2006" xmlns:aink="http://schemas.microsoft.com/office/drawing/2016/ink" xmlns:am3d="http://schemas.microsoft.com/office/drawing/2017/model3d" xmlns:o="urn:schemas-microsoft-com:office:office" xmlns:oel="http://schemas.microsoft.com/office/2019/extlst" xmlns:r="http://schemas.openxmlformats.org/officeDocument/2006/relationships" xmlns:m="http://schemas.openxmlformats.org/officeDocument/2006/math" xmlns:v="urn:schemas-microsoft-com:vml" xmlns:wp14="http://schemas.microsoft.com/office/word/2010/wordprocessingDrawing" xmlns:wp="http://schemas.openxmlformats.org/drawingml/2006/wordprocessingDrawing" xmlns:w10="urn:schemas-microsoft-com:office:word" xmlns:w="http://schemas.openxmlformats.org/wordprocessingml/2006/main" xmlns:w14="http://schemas.microsoft.com/office/word/2010/wordml" xmlns:w15="http://schemas.microsoft.com/office/word/2012/wordml" xmlns:w16cex="http://schemas.microsoft.com/office/word/2018/wordml/cex" xmlns:w16cid="http://schemas.microsoft.com/office/word/2016/wordml/cid" xmlns:w16="http://schemas.microsoft.com/office/word/2018/wordml" xmlns:w16du="http://schemas.microsoft.com/office/word/2023/wordml/word16du" xmlns:w16sdtdh="http://schemas.microsoft.com/office/word/2020/wordml/sdtdatahash" xmlns:w16sdtfl="http://schemas.microsoft.com/office/word/2024/wordml/sdtformatlock" xmlns:w16se="http://schemas.microsoft.com/office/word/2015/wordml/symex" xmlns:wpg="http://schemas.microsoft.com/office/word/2010/wordprocessingGroup" xmlns:wpi="http://schemas.microsoft.com/office/word/2010/wordprocessingInk" xmlns:wne="http://schemas.microsoft.com/office/word/2006/wordml" xmlns:wps="http://schemas.microsoft.com/office/word/2010/wordprocessingShape" mc:Ignorable="w14 w15 w16se w16cid w16 w16cex w16sdtdh w16sdtfl w16du wp14">
   <w:body>
     <w:p>
       <w:pPr>
@@ -69,7 +69,19 @@
           <w:rPr>
             <w:rStyle w:val="Hyperlink"/>
           </w:rPr>
-          <w:t>https://github.com/juarendra/30pad-QMK-VIA</w:t>
+          <w:t>https://</w:t>
+        </w:r>
+        <w:r>
+          <w:rPr>
+            <w:rStyle w:val="Hyperlink"/>
+          </w:rPr>
+          <w:t>github.com/</w:t>
+        </w:r>
+        <w:r>
+          <w:rPr>
+            <w:rStyle w:val="Hyperlink"/>
+          </w:rPr>
+          <w:t>juarendra/12pad-QMK-VIA</w:t>
         </w:r>
       </w:hyperlink>
     </w:p>
@@ -185,7 +197,15 @@
         <w:ind w:right="0" w:hanging="360"/>
       </w:pPr>
       <w:r>
-        <w:t xml:space="preserve">Link Keycode.txt  = </w:t>
+        <w:t xml:space="preserve">Link </w:t>
+      </w:r>
+      <w:proofErr w:type="gramStart"/>
+      <w:r>
+        <w:t>Keycode.txt  =</w:t>
+      </w:r>
+      <w:proofErr w:type="gramEnd"/>
+      <w:r>
+        <w:t xml:space="preserve"> </w:t>
       </w:r>
       <w:proofErr w:type="spellStart"/>
       <w:r>
@@ -273,13 +293,18 @@
         <w:ind w:right="0" w:hanging="360"/>
       </w:pPr>
       <w:r>
-        <w:t xml:space="preserve">LINK TUTORIAL PENGGUNAAN.txt =  </w:t>
+        <w:t xml:space="preserve">LINK TUTORIAL PENGGUNAAN.txt </w:t>
+      </w:r>
+      <w:proofErr w:type="gramStart"/>
+      <w:r>
+        <w:t xml:space="preserve">=  </w:t>
       </w:r>
       <w:proofErr w:type="spellStart"/>
       <w:r>
         <w:t>berisi</w:t>
       </w:r>
       <w:proofErr w:type="spellEnd"/>
+      <w:proofErr w:type="gramEnd"/>
       <w:r>
         <w:t xml:space="preserve"> link video tutorial </w:t>
       </w:r>
@@ -942,7 +967,21 @@
         <w:rPr>
           <w:sz w:val="22"/>
         </w:rPr>
-        <w:t xml:space="preserve">Pada Tab Setting , </w:t>
+        <w:t xml:space="preserve">Pada Tab </w:t>
+      </w:r>
+      <w:proofErr w:type="gramStart"/>
+      <w:r>
+        <w:rPr>
+          <w:sz w:val="22"/>
+        </w:rPr>
+        <w:t>Setting ,</w:t>
+      </w:r>
+      <w:proofErr w:type="gramEnd"/>
+      <w:r>
+        <w:rPr>
+          <w:sz w:val="22"/>
+        </w:rPr>
+        <w:t xml:space="preserve"> </w:t>
       </w:r>
       <w:proofErr w:type="spellStart"/>
       <w:r>
@@ -1043,15 +1082,31 @@
           <w:b/>
           <w:sz w:val="22"/>
         </w:rPr>
-        <w:t>30pad</w:t>
+        <w:t>12</w:t>
       </w:r>
       <w:r>
         <w:rPr>
           <w:b/>
           <w:sz w:val="22"/>
         </w:rPr>
-        <w:t>_via_definitions.json</w:t>
-      </w:r>
+        <w:t>pad</w:t>
+      </w:r>
+      <w:r>
+        <w:rPr>
+          <w:b/>
+          <w:sz w:val="22"/>
+        </w:rPr>
+        <w:t>_via_</w:t>
+      </w:r>
+      <w:proofErr w:type="gramStart"/>
+      <w:r>
+        <w:rPr>
+          <w:b/>
+          <w:sz w:val="22"/>
+        </w:rPr>
+        <w:t>definitions.json</w:t>
+      </w:r>
+      <w:proofErr w:type="gramEnd"/>
       <w:r>
         <w:rPr>
           <w:sz w:val="22"/>
@@ -1266,7 +1321,7 @@
 </file>
 
 <file path=word/numbering.xml><?xml version="1.0" encoding="utf-8"?>
-<w:numbering xmlns:wpc="http://schemas.microsoft.com/office/word/2010/wordprocessingCanvas" xmlns:cx="http://schemas.microsoft.com/office/drawing/2014/chartex" xmlns:cx1="http://schemas.microsoft.com/office/drawing/2015/9/8/chartex" xmlns:cx2="http://schemas.microsoft.com/office/drawing/2015/10/21/chartex" xmlns:cx3="http://schemas.microsoft.com/office/drawing/2016/5/9/chartex" xmlns:cx4="http://schemas.microsoft.com/office/drawing/2016/5/10/chartex" xmlns:cx5="http://schemas.microsoft.com/office/drawing/2016/5/11/chartex" xmlns:cx6="http://schemas.microsoft.com/office/drawing/2016/5/12/chartex" xmlns:cx7="http://schemas.microsoft.com/office/drawing/2016/5/13/chartex" xmlns:cx8="http://schemas.microsoft.com/office/drawing/2016/5/14/chartex" xmlns:mc="http://schemas.openxmlformats.org/markup-compatibility/2006" xmlns:aink="http://schemas.microsoft.com/office/drawing/2016/ink" xmlns:am3d="http://schemas.microsoft.com/office/drawing/2017/model3d" xmlns:o="urn:schemas-microsoft-com:office:office" xmlns:oel="http://schemas.microsoft.com/office/2019/extlst" xmlns:r="http://schemas.openxmlformats.org/officeDocument/2006/relationships" xmlns:m="http://schemas.openxmlformats.org/officeDocument/2006/math" xmlns:v="urn:schemas-microsoft-com:vml" xmlns:wp14="http://schemas.microsoft.com/office/word/2010/wordprocessingDrawing" xmlns:wp="http://schemas.openxmlformats.org/drawingml/2006/wordprocessingDrawing" xmlns:w10="urn:schemas-microsoft-com:office:word" xmlns:w="http://schemas.openxmlformats.org/wordprocessingml/2006/main" xmlns:w14="http://schemas.microsoft.com/office/word/2010/wordml" xmlns:w15="http://schemas.microsoft.com/office/word/2012/wordml" xmlns:w16cex="http://schemas.microsoft.com/office/word/2018/wordml/cex" xmlns:w16cid="http://schemas.microsoft.com/office/word/2016/wordml/cid" xmlns:w16="http://schemas.microsoft.com/office/word/2018/wordml" xmlns:w16du="http://schemas.microsoft.com/office/word/2023/wordml/word16du" xmlns:w16sdtdh="http://schemas.microsoft.com/office/word/2020/wordml/sdtdatahash" xmlns:w16se="http://schemas.microsoft.com/office/word/2015/wordml/symex" xmlns:wpg="http://schemas.microsoft.com/office/word/2010/wordprocessingGroup" xmlns:wpi="http://schemas.microsoft.com/office/word/2010/wordprocessingInk" xmlns:wne="http://schemas.microsoft.com/office/word/2006/wordml" xmlns:wps="http://schemas.microsoft.com/office/word/2010/wordprocessingShape" mc:Ignorable="w14 w15 w16se w16cid w16 w16cex w16sdtdh w16du wp14">
+<w:numbering xmlns:wpc="http://schemas.microsoft.com/office/word/2010/wordprocessingCanvas" xmlns:cx="http://schemas.microsoft.com/office/drawing/2014/chartex" xmlns:cx1="http://schemas.microsoft.com/office/drawing/2015/9/8/chartex" xmlns:cx2="http://schemas.microsoft.com/office/drawing/2015/10/21/chartex" xmlns:cx3="http://schemas.microsoft.com/office/drawing/2016/5/9/chartex" xmlns:cx4="http://schemas.microsoft.com/office/drawing/2016/5/10/chartex" xmlns:cx5="http://schemas.microsoft.com/office/drawing/2016/5/11/chartex" xmlns:cx6="http://schemas.microsoft.com/office/drawing/2016/5/12/chartex" xmlns:cx7="http://schemas.microsoft.com/office/drawing/2016/5/13/chartex" xmlns:cx8="http://schemas.microsoft.com/office/drawing/2016/5/14/chartex" xmlns:mc="http://schemas.openxmlformats.org/markup-compatibility/2006" xmlns:aink="http://schemas.microsoft.com/office/drawing/2016/ink" xmlns:am3d="http://schemas.microsoft.com/office/drawing/2017/model3d" xmlns:o="urn:schemas-microsoft-com:office:office" xmlns:oel="http://schemas.microsoft.com/office/2019/extlst" xmlns:r="http://schemas.openxmlformats.org/officeDocument/2006/relationships" xmlns:m="http://schemas.openxmlformats.org/officeDocument/2006/math" xmlns:v="urn:schemas-microsoft-com:vml" xmlns:wp14="http://schemas.microsoft.com/office/word/2010/wordprocessingDrawing" xmlns:wp="http://schemas.openxmlformats.org/drawingml/2006/wordprocessingDrawing" xmlns:w10="urn:schemas-microsoft-com:office:word" xmlns:w="http://schemas.openxmlformats.org/wordprocessingml/2006/main" xmlns:w14="http://schemas.microsoft.com/office/word/2010/wordml" xmlns:w15="http://schemas.microsoft.com/office/word/2012/wordml" xmlns:w16cex="http://schemas.microsoft.com/office/word/2018/wordml/cex" xmlns:w16cid="http://schemas.microsoft.com/office/word/2016/wordml/cid" xmlns:w16="http://schemas.microsoft.com/office/word/2018/wordml" xmlns:w16du="http://schemas.microsoft.com/office/word/2023/wordml/word16du" xmlns:w16sdtdh="http://schemas.microsoft.com/office/word/2020/wordml/sdtdatahash" xmlns:w16sdtfl="http://schemas.microsoft.com/office/word/2024/wordml/sdtformatlock" xmlns:w16se="http://schemas.microsoft.com/office/word/2015/wordml/symex" xmlns:wpg="http://schemas.microsoft.com/office/word/2010/wordprocessingGroup" xmlns:wpi="http://schemas.microsoft.com/office/word/2010/wordprocessingInk" xmlns:wne="http://schemas.microsoft.com/office/word/2006/wordml" xmlns:wps="http://schemas.microsoft.com/office/word/2010/wordprocessingShape" mc:Ignorable="w14 w15 w16se w16cid w16 w16cex w16sdtdh w16sdtfl w16du wp14">
   <w:abstractNum w:abstractNumId="0" w15:restartNumberingAfterBreak="0">
     <w:nsid w:val="50982829"/>
     <w:multiLevelType w:val="hybridMultilevel"/>
@@ -1701,7 +1756,7 @@
 </file>
 
 <file path=word/styles.xml><?xml version="1.0" encoding="utf-8"?>
-<w:styles xmlns:mc="http://schemas.openxmlformats.org/markup-compatibility/2006" xmlns:r="http://schemas.openxmlformats.org/officeDocument/2006/relationships" xmlns:w="http://schemas.openxmlformats.org/wordprocessingml/2006/main" xmlns:w14="http://schemas.microsoft.com/office/word/2010/wordml" xmlns:w15="http://schemas.microsoft.com/office/word/2012/wordml" xmlns:w16cex="http://schemas.microsoft.com/office/word/2018/wordml/cex" xmlns:w16cid="http://schemas.microsoft.com/office/word/2016/wordml/cid" xmlns:w16="http://schemas.microsoft.com/office/word/2018/wordml" xmlns:w16du="http://schemas.microsoft.com/office/word/2023/wordml/word16du" xmlns:w16sdtdh="http://schemas.microsoft.com/office/word/2020/wordml/sdtdatahash" xmlns:w16se="http://schemas.microsoft.com/office/word/2015/wordml/symex" mc:Ignorable="w14 w15 w16se w16cid w16 w16cex w16sdtdh w16du">
+<w:styles xmlns:mc="http://schemas.openxmlformats.org/markup-compatibility/2006" xmlns:r="http://schemas.openxmlformats.org/officeDocument/2006/relationships" xmlns:w="http://schemas.openxmlformats.org/wordprocessingml/2006/main" xmlns:w14="http://schemas.microsoft.com/office/word/2010/wordml" xmlns:w15="http://schemas.microsoft.com/office/word/2012/wordml" xmlns:w16cex="http://schemas.microsoft.com/office/word/2018/wordml/cex" xmlns:w16cid="http://schemas.microsoft.com/office/word/2016/wordml/cid" xmlns:w16="http://schemas.microsoft.com/office/word/2018/wordml" xmlns:w16du="http://schemas.microsoft.com/office/word/2023/wordml/word16du" xmlns:w16sdtdh="http://schemas.microsoft.com/office/word/2020/wordml/sdtdatahash" xmlns:w16sdtfl="http://schemas.microsoft.com/office/word/2024/wordml/sdtformatlock" xmlns:w16se="http://schemas.microsoft.com/office/word/2015/wordml/symex" mc:Ignorable="w14 w15 w16se w16cid w16 w16cex w16sdtdh w16sdtfl w16du">
   <w:docDefaults>
     <w:rPrDefault>
       <w:rPr>
@@ -2201,6 +2256,18 @@
       <w:shd w:val="clear" w:color="auto" w:fill="E1DFDD"/>
     </w:rPr>
   </w:style>
+  <w:style w:type="character" w:styleId="FollowedHyperlink">
+    <w:name w:val="FollowedHyperlink"/>
+    <w:basedOn w:val="DefaultParagraphFont"/>
+    <w:uiPriority w:val="99"/>
+    <w:semiHidden/>
+    <w:unhideWhenUsed/>
+    <w:rsid w:val="0075361E"/>
+    <w:rPr>
+      <w:color w:val="954F72" w:themeColor="followedHyperlink"/>
+      <w:u w:val="single"/>
+    </w:rPr>
+  </w:style>
 </w:styles>
 </file>
 

</xml_diff>